<commit_message>
docs: add Task 6 MVP evidence screenshots
</commit_message>
<xml_diff>
--- a/docs/reports/task-06-mvp-completion.docx
+++ b/docs/reports/task-06-mvp-completion.docx
@@ -620,8 +620,238 @@
       </w:r>
     </w:p>
     <w:p>
+      <w:pPr>
+        <w:jc w:val="center"/>
+      </w:pPr>
       <w:r>
-        <w:t>(No screenshots found in docs/screenshots/task-06. Add images there and re-run.)</w:t>
+        <w:drawing>
+          <wp:inline xmlns:a="http://schemas.openxmlformats.org/drawingml/2006/main" xmlns:pic="http://schemas.openxmlformats.org/drawingml/2006/picture">
+            <wp:extent cx="5486400" cy="3084849"/>
+            <wp:docPr id="1" name="Picture 1"/>
+            <wp:cNvGraphicFramePr>
+              <a:graphicFrameLocks noChangeAspect="1"/>
+            </wp:cNvGraphicFramePr>
+            <a:graphic>
+              <a:graphicData uri="http://schemas.openxmlformats.org/drawingml/2006/picture">
+                <pic:pic>
+                  <pic:nvPicPr>
+                    <pic:cNvPr id="0" name="Screenshot 2026-10-12 000847.png"/>
+                    <pic:cNvPicPr/>
+                  </pic:nvPicPr>
+                  <pic:blipFill>
+                    <a:blip r:embed="rId9"/>
+                    <a:stretch>
+                      <a:fillRect/>
+                    </a:stretch>
+                  </pic:blipFill>
+                  <pic:spPr>
+                    <a:xfrm>
+                      <a:off x="0" y="0"/>
+                      <a:ext cx="5486400" cy="3084849"/>
+                    </a:xfrm>
+                    <a:prstGeom prst="rect"/>
+                  </pic:spPr>
+                </pic:pic>
+              </a:graphicData>
+            </a:graphic>
+          </wp:inline>
+        </w:drawing>
+      </w:r>
+    </w:p>
+    <w:p>
+      <w:pPr>
+        <w:jc w:val="center"/>
+      </w:pPr>
+      <w:r>
+        <w:t>Figure 1: Screenshot 2026-10-12 000847.png</w:t>
+      </w:r>
+    </w:p>
+    <w:p>
+      <w:pPr>
+        <w:jc w:val="center"/>
+      </w:pPr>
+      <w:r>
+        <w:drawing>
+          <wp:inline xmlns:a="http://schemas.openxmlformats.org/drawingml/2006/main" xmlns:pic="http://schemas.openxmlformats.org/drawingml/2006/picture">
+            <wp:extent cx="5486400" cy="2441158"/>
+            <wp:docPr id="2" name="Picture 2"/>
+            <wp:cNvGraphicFramePr>
+              <a:graphicFrameLocks noChangeAspect="1"/>
+            </wp:cNvGraphicFramePr>
+            <a:graphic>
+              <a:graphicData uri="http://schemas.openxmlformats.org/drawingml/2006/picture">
+                <pic:pic>
+                  <pic:nvPicPr>
+                    <pic:cNvPr id="0" name="Screenshot 2026-10-12 001212.png"/>
+                    <pic:cNvPicPr/>
+                  </pic:nvPicPr>
+                  <pic:blipFill>
+                    <a:blip r:embed="rId10"/>
+                    <a:stretch>
+                      <a:fillRect/>
+                    </a:stretch>
+                  </pic:blipFill>
+                  <pic:spPr>
+                    <a:xfrm>
+                      <a:off x="0" y="0"/>
+                      <a:ext cx="5486400" cy="2441158"/>
+                    </a:xfrm>
+                    <a:prstGeom prst="rect"/>
+                  </pic:spPr>
+                </pic:pic>
+              </a:graphicData>
+            </a:graphic>
+          </wp:inline>
+        </w:drawing>
+      </w:r>
+    </w:p>
+    <w:p>
+      <w:pPr>
+        <w:jc w:val="center"/>
+      </w:pPr>
+      <w:r>
+        <w:t>Figure 2: Screenshot 2026-10-12 001212.png</w:t>
+      </w:r>
+    </w:p>
+    <w:p>
+      <w:pPr>
+        <w:jc w:val="center"/>
+      </w:pPr>
+      <w:r>
+        <w:drawing>
+          <wp:inline xmlns:a="http://schemas.openxmlformats.org/drawingml/2006/main" xmlns:pic="http://schemas.openxmlformats.org/drawingml/2006/picture">
+            <wp:extent cx="5486400" cy="2350089"/>
+            <wp:docPr id="3" name="Picture 3"/>
+            <wp:cNvGraphicFramePr>
+              <a:graphicFrameLocks noChangeAspect="1"/>
+            </wp:cNvGraphicFramePr>
+            <a:graphic>
+              <a:graphicData uri="http://schemas.openxmlformats.org/drawingml/2006/picture">
+                <pic:pic>
+                  <pic:nvPicPr>
+                    <pic:cNvPr id="0" name="Screenshot 2026-10-12 001253.png"/>
+                    <pic:cNvPicPr/>
+                  </pic:nvPicPr>
+                  <pic:blipFill>
+                    <a:blip r:embed="rId11"/>
+                    <a:stretch>
+                      <a:fillRect/>
+                    </a:stretch>
+                  </pic:blipFill>
+                  <pic:spPr>
+                    <a:xfrm>
+                      <a:off x="0" y="0"/>
+                      <a:ext cx="5486400" cy="2350089"/>
+                    </a:xfrm>
+                    <a:prstGeom prst="rect"/>
+                  </pic:spPr>
+                </pic:pic>
+              </a:graphicData>
+            </a:graphic>
+          </wp:inline>
+        </w:drawing>
+      </w:r>
+    </w:p>
+    <w:p>
+      <w:pPr>
+        <w:jc w:val="center"/>
+      </w:pPr>
+      <w:r>
+        <w:t>Figure 3: Screenshot 2026-10-12 001253.png</w:t>
+      </w:r>
+    </w:p>
+    <w:p>
+      <w:pPr>
+        <w:jc w:val="center"/>
+      </w:pPr>
+      <w:r>
+        <w:drawing>
+          <wp:inline xmlns:a="http://schemas.openxmlformats.org/drawingml/2006/main" xmlns:pic="http://schemas.openxmlformats.org/drawingml/2006/picture">
+            <wp:extent cx="5486400" cy="2527086"/>
+            <wp:docPr id="4" name="Picture 4"/>
+            <wp:cNvGraphicFramePr>
+              <a:graphicFrameLocks noChangeAspect="1"/>
+            </wp:cNvGraphicFramePr>
+            <a:graphic>
+              <a:graphicData uri="http://schemas.openxmlformats.org/drawingml/2006/picture">
+                <pic:pic>
+                  <pic:nvPicPr>
+                    <pic:cNvPr id="0" name="Screenshot 2026-10-12 001354.png"/>
+                    <pic:cNvPicPr/>
+                  </pic:nvPicPr>
+                  <pic:blipFill>
+                    <a:blip r:embed="rId12"/>
+                    <a:stretch>
+                      <a:fillRect/>
+                    </a:stretch>
+                  </pic:blipFill>
+                  <pic:spPr>
+                    <a:xfrm>
+                      <a:off x="0" y="0"/>
+                      <a:ext cx="5486400" cy="2527086"/>
+                    </a:xfrm>
+                    <a:prstGeom prst="rect"/>
+                  </pic:spPr>
+                </pic:pic>
+              </a:graphicData>
+            </a:graphic>
+          </wp:inline>
+        </w:drawing>
+      </w:r>
+    </w:p>
+    <w:p>
+      <w:pPr>
+        <w:jc w:val="center"/>
+      </w:pPr>
+      <w:r>
+        <w:t>Figure 4: Screenshot 2026-10-12 001354.png</w:t>
+      </w:r>
+    </w:p>
+    <w:p>
+      <w:pPr>
+        <w:jc w:val="center"/>
+      </w:pPr>
+      <w:r>
+        <w:drawing>
+          <wp:inline xmlns:a="http://schemas.openxmlformats.org/drawingml/2006/main" xmlns:pic="http://schemas.openxmlformats.org/drawingml/2006/picture">
+            <wp:extent cx="5486400" cy="2238588"/>
+            <wp:docPr id="5" name="Picture 5"/>
+            <wp:cNvGraphicFramePr>
+              <a:graphicFrameLocks noChangeAspect="1"/>
+            </wp:cNvGraphicFramePr>
+            <a:graphic>
+              <a:graphicData uri="http://schemas.openxmlformats.org/drawingml/2006/picture">
+                <pic:pic>
+                  <pic:nvPicPr>
+                    <pic:cNvPr id="0" name="Screenshot 2026-10-12 001424.png"/>
+                    <pic:cNvPicPr/>
+                  </pic:nvPicPr>
+                  <pic:blipFill>
+                    <a:blip r:embed="rId13"/>
+                    <a:stretch>
+                      <a:fillRect/>
+                    </a:stretch>
+                  </pic:blipFill>
+                  <pic:spPr>
+                    <a:xfrm>
+                      <a:off x="0" y="0"/>
+                      <a:ext cx="5486400" cy="2238588"/>
+                    </a:xfrm>
+                    <a:prstGeom prst="rect"/>
+                  </pic:spPr>
+                </pic:pic>
+              </a:graphicData>
+            </a:graphic>
+          </wp:inline>
+        </w:drawing>
+      </w:r>
+    </w:p>
+    <w:p>
+      <w:pPr>
+        <w:jc w:val="center"/>
+      </w:pPr>
+      <w:r>
+        <w:t>Figure 5: Screenshot 2026-10-12 001424.png</w:t>
       </w:r>
     </w:p>
     <w:p>

</xml_diff>